<commit_message>
feat: implement mode, carrier, currency dropdowns, live conversions, and XML split placeholder cleaning for Quotations
</commit_message>
<xml_diff>
--- a/assets/Argus_Ambient_Premium_Quotation.docx
+++ b/assets/Argus_Ambient_Premium_Quotation.docx
@@ -1,6 +1,6 @@
 
 <file path=word/document.xml><?xml version="1.0" encoding="utf-8"?>
-<w:document xmlns:wpc="http://schemas.microsoft.com/office/word/2010/wordprocessingCanvas" xmlns:cx="http://schemas.microsoft.com/office/drawing/2014/chartex" xmlns:cx1="http://schemas.microsoft.com/office/drawing/2015/9/8/chartex" xmlns:cx2="http://schemas.microsoft.com/office/drawing/2015/10/21/chartex" xmlns:cx3="http://schemas.microsoft.com/office/drawing/2016/5/9/chartex" xmlns:cx4="http://schemas.microsoft.com/office/drawing/2016/5/10/chartex" xmlns:cx5="http://schemas.microsoft.com/office/drawing/2016/5/11/chartex" xmlns:cx6="http://schemas.microsoft.com/office/drawing/2016/5/12/chartex" xmlns:cx7="http://schemas.microsoft.com/office/drawing/2016/5/13/chartex" xmlns:cx8="http://schemas.microsoft.com/office/drawing/2016/5/14/chartex" xmlns:mc="http://schemas.openxmlformats.org/markup-compatibility/2006" xmlns:aink="http://schemas.microsoft.com/office/drawing/2016/ink" xmlns:am3d="http://schemas.microsoft.com/office/drawing/2017/model3d" xmlns:o="urn:schemas-microsoft-com:office:office" xmlns:oel="http://schemas.microsoft.com/office/2019/extlst" xmlns:r="http://schemas.openxmlformats.org/officeDocument/2006/relationships" xmlns:m="http://schemas.openxmlformats.org/officeDocument/2006/math" xmlns:v="urn:schemas-microsoft-com:vml" xmlns:wp14="http://schemas.microsoft.com/office/word/2010/wordprocessingDrawing" xmlns:wp="http://schemas.openxmlformats.org/drawingml/2006/wordprocessingDrawing" xmlns:w10="urn:schemas-microsoft-com:office:word" xmlns:w="http://schemas.openxmlformats.org/wordprocessingml/2006/main" xmlns:w14="http://schemas.microsoft.com/office/word/2010/wordml" xmlns:w15="http://schemas.microsoft.com/office/word/2012/wordml" xmlns:w16cex="http://schemas.microsoft.com/office/word/2018/wordml/cex" xmlns:w16cid="http://schemas.microsoft.com/office/word/2016/wordml/cid" xmlns:w16="http://schemas.microsoft.com/office/word/2018/wordml" xmlns:w16du="http://schemas.microsoft.com/office/word/2023/wordml/word16du" xmlns:w16sdtdh="http://schemas.microsoft.com/office/word/2020/wordml/sdtdatahash" xmlns:w16sdtfl="http://schemas.microsoft.com/office/word/2024/wordml/sdtformatlock" xmlns:w16se="http://schemas.microsoft.com/office/word/2015/wordml/symex" xmlns:wpg="http://schemas.microsoft.com/office/word/2010/wordprocessingGroup" xmlns:wpi="http://schemas.microsoft.com/office/word/2010/wordprocessingInk" xmlns:wne="http://schemas.microsoft.com/office/word/2006/wordml" xmlns:wps="http://schemas.microsoft.com/office/word/2010/wordprocessingShape" mc:Ignorable="w14 w15 w16se w16cid w16 w16cex w16sdtdh w16sdtfl w16du wp14">
+<w:document xmlns:wpc="http://schemas.microsoft.com/office/word/2010/wordprocessingCanvas" xmlns:cx="http://schemas.microsoft.com/office/drawing/2014/chartex" xmlns:cx1="http://schemas.microsoft.com/office/drawing/2015/9/8/chartex" xmlns:cx2="http://schemas.microsoft.com/office/drawing/2015/10/21/chartex" xmlns:cx3="http://schemas.microsoft.com/office/drawing/2016/5/9/chartex" xmlns:cx4="http://schemas.microsoft.com/office/drawing/2016/5/10/chartex" xmlns:cx5="http://schemas.microsoft.com/office/drawing/2016/5/11/chartex" xmlns:cx6="http://schemas.microsoft.com/office/drawing/2016/5/12/chartex" xmlns:cx7="http://schemas.microsoft.com/office/drawing/2016/5/13/chartex" xmlns:cx8="http://schemas.microsoft.com/office/drawing/2016/5/14/chartex" xmlns:mc="http://schemas.openxmlformats.org/markup-compatibility/2006" xmlns:aink="http://schemas.microsoft.com/office/drawing/2016/ink" xmlns:am3d="http://schemas.microsoft.com/office/drawing/2017/model3d" xmlns:o="urn:schemas-microsoft-com:office:office" xmlns:r="http://schemas.openxmlformats.org/officeDocument/2006/relationships" xmlns:m="http://schemas.openxmlformats.org/officeDocument/2006/math" xmlns:v="urn:schemas-microsoft-com:vml" xmlns:wp14="http://schemas.microsoft.com/office/word/2010/wordprocessingDrawing" xmlns:wp="http://schemas.openxmlformats.org/drawingml/2006/wordprocessingDrawing" xmlns:w10="urn:schemas-microsoft-com:office:word" xmlns:w="http://schemas.openxmlformats.org/wordprocessingml/2006/main" xmlns:w14="http://schemas.microsoft.com/office/word/2010/wordml" xmlns:w15="http://schemas.microsoft.com/office/word/2012/wordml" xmlns:w16cex="http://schemas.microsoft.com/office/word/2018/wordml/cex" xmlns:w16cid="http://schemas.microsoft.com/office/word/2016/wordml/cid" xmlns:w16="http://schemas.microsoft.com/office/word/2018/wordml" xmlns:w16se="http://schemas.microsoft.com/office/word/2015/wordml/symex" xmlns:wpg="http://schemas.microsoft.com/office/word/2010/wordprocessingGroup" xmlns:wpi="http://schemas.microsoft.com/office/word/2010/wordprocessingInk" xmlns:wne="http://schemas.microsoft.com/office/word/2006/wordml" xmlns:wps="http://schemas.microsoft.com/office/word/2010/wordprocessingShape" mc:Ignorable="w14 w15 w16se w16cid w16 w16cex wp14">
   <w:body>
     <w:p>
       <w:pPr>
@@ -53,9 +53,83 @@
           <w:p>
             <w:pPr>
               <w:ind w:left="0" w:firstLine="0"/>
+              <w:rPr>
+                <w:b/>
+                <w:bCs/>
+              </w:rPr>
             </w:pPr>
             <w:r>
               <w:t xml:space="preserve"> </w:t>
+            </w:r>
+            <w:r>
+              <w:rPr>
+                <w:b/>
+                <w:bCs/>
+                <w:sz w:val="18"/>
+                <w:szCs w:val="18"/>
+              </w:rPr>
+              <w:t>Q.</w:t>
+            </w:r>
+            <w:proofErr w:type="gramStart"/>
+            <w:r>
+              <w:rPr>
+                <w:b/>
+                <w:bCs/>
+                <w:sz w:val="18"/>
+                <w:szCs w:val="18"/>
+              </w:rPr>
+              <w:t>NO</w:t>
+            </w:r>
+            <w:r>
+              <w:rPr>
+                <w:b/>
+                <w:bCs/>
+                <w:sz w:val="18"/>
+                <w:szCs w:val="18"/>
+              </w:rPr>
+              <w:t xml:space="preserve"> :</w:t>
+            </w:r>
+            <w:proofErr w:type="gramEnd"/>
+            <w:r>
+              <w:rPr>
+                <w:b/>
+                <w:bCs/>
+                <w:sz w:val="18"/>
+                <w:szCs w:val="18"/>
+              </w:rPr>
+              <w:t xml:space="preserve"> </w:t>
+            </w:r>
+            <w:r>
+              <w:rPr>
+                <w:b/>
+                <w:bCs/>
+                <w:color w:val="FF0000"/>
+                <w:sz w:val="18"/>
+                <w:szCs w:val="18"/>
+              </w:rPr>
+              <w:t>{</w:t>
+            </w:r>
+            <w:proofErr w:type="spellStart"/>
+            <w:r>
+              <w:rPr>
+                <w:b/>
+                <w:bCs/>
+                <w:color w:val="FF0000"/>
+                <w:sz w:val="18"/>
+                <w:szCs w:val="18"/>
+              </w:rPr>
+              <w:t>Q_no</w:t>
+            </w:r>
+            <w:proofErr w:type="spellEnd"/>
+            <w:r>
+              <w:rPr>
+                <w:b/>
+                <w:bCs/>
+                <w:color w:val="FF0000"/>
+                <w:sz w:val="18"/>
+                <w:szCs w:val="18"/>
+              </w:rPr>
+              <w:t>}</w:t>
             </w:r>
           </w:p>
           <w:p>
@@ -141,38 +215,129 @@
         <w:ind w:left="0" w:firstLine="0"/>
       </w:pPr>
     </w:p>
+    <w:tbl>
+      <w:tblPr>
+        <w:tblStyle w:val="TableGrid"/>
+        <w:tblW w:w="0" w:type="auto"/>
+        <w:tblBorders>
+          <w:top w:val="none" w:sz="0" w:space="0" w:color="auto"/>
+          <w:left w:val="none" w:sz="0" w:space="0" w:color="auto"/>
+          <w:bottom w:val="none" w:sz="0" w:space="0" w:color="auto"/>
+          <w:right w:val="none" w:sz="0" w:space="0" w:color="auto"/>
+          <w:insideH w:val="none" w:sz="0" w:space="0" w:color="auto"/>
+          <w:insideV w:val="none" w:sz="0" w:space="0" w:color="auto"/>
+        </w:tblBorders>
+        <w:tblLook w:val="04A0" w:firstRow="1" w:lastRow="0" w:firstColumn="1" w:lastColumn="0" w:noHBand="0" w:noVBand="1"/>
+      </w:tblPr>
+      <w:tblGrid>
+        <w:gridCol w:w="5395"/>
+        <w:gridCol w:w="5395"/>
+      </w:tblGrid>
+      <w:tr>
+        <w:tc>
+          <w:tcPr>
+            <w:tcW w:w="5395" w:type="dxa"/>
+          </w:tcPr>
+          <w:p>
+            <w:pPr>
+              <w:ind w:left="0" w:firstLine="0"/>
+            </w:pPr>
+            <w:r>
+              <w:rPr>
+                <w:b/>
+                <w:bCs/>
+                <w:color w:val="B8935A"/>
+                <w:sz w:val="18"/>
+                <w:szCs w:val="18"/>
+              </w:rPr>
+              <w:t>PREPARED FOR:</w:t>
+            </w:r>
+            <w:r>
+              <w:br/>
+            </w:r>
+            <w:r>
+              <w:t>{</w:t>
+            </w:r>
+            <w:r>
+              <w:rPr>
+                <w:color w:val="FF0000"/>
+              </w:rPr>
+              <w:t>C_NAME</w:t>
+            </w:r>
+            <w:r>
+              <w:t>}</w:t>
+            </w:r>
+            <w:r>
+              <w:br/>
+              <w:t>Doha, Qatar</w:t>
+            </w:r>
+          </w:p>
+        </w:tc>
+        <w:tc>
+          <w:tcPr>
+            <w:tcW w:w="5395" w:type="dxa"/>
+          </w:tcPr>
+          <w:p>
+            <w:pPr>
+              <w:ind w:left="0" w:firstLine="0"/>
+              <w:jc w:val="right"/>
+            </w:pPr>
+            <w:r>
+              <w:t>Sales Person: {</w:t>
+            </w:r>
+            <w:r>
+              <w:rPr>
+                <w:color w:val="FF0000"/>
+              </w:rPr>
+              <w:t>SALES_P</w:t>
+            </w:r>
+            <w:r>
+              <w:t>}</w:t>
+            </w:r>
+          </w:p>
+          <w:p>
+            <w:pPr>
+              <w:ind w:left="0" w:firstLine="0"/>
+              <w:jc w:val="right"/>
+            </w:pPr>
+            <w:r>
+              <w:t>Operator: {</w:t>
+            </w:r>
+            <w:r>
+              <w:rPr>
+                <w:color w:val="FF0000"/>
+              </w:rPr>
+              <w:t>OPERATOR</w:t>
+            </w:r>
+            <w:r>
+              <w:t>}</w:t>
+            </w:r>
+          </w:p>
+          <w:p>
+            <w:pPr>
+              <w:ind w:left="0" w:firstLine="0"/>
+              <w:jc w:val="right"/>
+            </w:pPr>
+            <w:r>
+              <w:t>TRANSIT TIME: {</w:t>
+            </w:r>
+            <w:r>
+              <w:rPr>
+                <w:color w:val="FF0000"/>
+              </w:rPr>
+              <w:t>TT</w:t>
+            </w:r>
+            <w:r>
+              <w:t>}</w:t>
+            </w:r>
+          </w:p>
+        </w:tc>
+      </w:tr>
+    </w:tbl>
     <w:p>
       <w:pPr>
         <w:ind w:left="0" w:firstLine="0"/>
       </w:pPr>
-      <w:r>
-        <w:rPr>
-          <w:b/>
-          <w:bCs/>
-          <w:color w:val="B8935A"/>
-          <w:sz w:val="18"/>
-          <w:szCs w:val="18"/>
-        </w:rPr>
-        <w:t>PREPARED FOR:</w:t>
-      </w:r>
-      <w:r>
-        <w:br/>
-      </w:r>
-      <w:r>
-        <w:t>{</w:t>
-      </w:r>
-      <w:proofErr w:type="spellStart"/>
-      <w:r>
-        <w:t>C_Name</w:t>
-      </w:r>
-      <w:proofErr w:type="spellEnd"/>
-      <w:r>
-        <w:t>}</w:t>
-      </w:r>
-      <w:r>
-        <w:br/>
-        <w:t>Doha, Qatar</w:t>
-      </w:r>
     </w:p>
     <w:tbl>
       <w:tblPr>
@@ -353,11 +518,6 @@
         <w:ind w:left="0" w:firstLine="0"/>
       </w:pPr>
     </w:p>
-    <w:p>
-      <w:pPr>
-        <w:ind w:left="0" w:firstLine="0"/>
-      </w:pPr>
-    </w:p>
     <w:tbl>
       <w:tblPr>
         <w:tblStyle w:val="a0"/>
@@ -367,18 +527,19 @@
         <w:tblLook w:val="0400" w:firstRow="0" w:lastRow="0" w:firstColumn="0" w:lastColumn="0" w:noHBand="0" w:noVBand="1"/>
       </w:tblPr>
       <w:tblGrid>
-        <w:gridCol w:w="664"/>
-        <w:gridCol w:w="5706"/>
+        <w:gridCol w:w="720"/>
+        <w:gridCol w:w="5650"/>
         <w:gridCol w:w="578"/>
-        <w:gridCol w:w="3820"/>
+        <w:gridCol w:w="1910"/>
+        <w:gridCol w:w="1910"/>
       </w:tblGrid>
       <w:tr>
         <w:trPr>
-          <w:trHeight w:val="492"/>
+          <w:trHeight w:val="422"/>
         </w:trPr>
         <w:tc>
           <w:tcPr>
-            <w:tcW w:w="664" w:type="dxa"/>
+            <w:tcW w:w="720" w:type="dxa"/>
             <w:shd w:val="clear" w:color="auto" w:fill="40404A"/>
             <w:tcMar>
               <w:top w:w="100" w:type="dxa"/>
@@ -391,7 +552,37 @@
         </w:tc>
         <w:tc>
           <w:tcPr>
-            <w:tcW w:w="6284" w:type="dxa"/>
+            <w:tcW w:w="6228" w:type="dxa"/>
+            <w:gridSpan w:val="2"/>
+            <w:vMerge w:val="restart"/>
+            <w:shd w:val="clear" w:color="auto" w:fill="40404A"/>
+            <w:tcMar>
+              <w:top w:w="100" w:type="dxa"/>
+              <w:left w:w="150" w:type="dxa"/>
+              <w:bottom w:w="100" w:type="dxa"/>
+              <w:right w:w="150" w:type="dxa"/>
+            </w:tcMar>
+          </w:tcPr>
+          <w:p>
+            <w:pPr>
+              <w:spacing w:before="240"/>
+              <w:jc w:val="center"/>
+            </w:pPr>
+            <w:r>
+              <w:rPr>
+                <w:b/>
+                <w:bCs/>
+                <w:color w:val="FFFFFF"/>
+                <w:sz w:val="17"/>
+                <w:szCs w:val="17"/>
+              </w:rPr>
+              <w:t>DESCRIPTION OF SERVICE</w:t>
+            </w:r>
+          </w:p>
+        </w:tc>
+        <w:tc>
+          <w:tcPr>
+            <w:tcW w:w="3820" w:type="dxa"/>
             <w:gridSpan w:val="2"/>
             <w:shd w:val="clear" w:color="auto" w:fill="40404A"/>
             <w:tcMar>
@@ -413,13 +604,33 @@
                 <w:sz w:val="17"/>
                 <w:szCs w:val="17"/>
               </w:rPr>
-              <w:t>DESCRIPTION OF SERVICE</w:t>
+              <w:t>TOTAL PRICE</w:t>
             </w:r>
           </w:p>
+        </w:tc>
+      </w:tr>
+      <w:tr>
+        <w:trPr>
+          <w:trHeight w:val="530"/>
+        </w:trPr>
+        <w:tc>
+          <w:tcPr>
+            <w:tcW w:w="720" w:type="dxa"/>
+            <w:shd w:val="clear" w:color="auto" w:fill="40404A"/>
+            <w:tcMar>
+              <w:top w:w="100" w:type="dxa"/>
+              <w:left w:w="150" w:type="dxa"/>
+              <w:bottom w:w="100" w:type="dxa"/>
+              <w:right w:w="150" w:type="dxa"/>
+            </w:tcMar>
+          </w:tcPr>
+          <w:p/>
         </w:tc>
         <w:tc>
           <w:tcPr>
-            <w:tcW w:w="3820" w:type="dxa"/>
+            <w:tcW w:w="6228" w:type="dxa"/>
+            <w:gridSpan w:val="2"/>
+            <w:vMerge/>
             <w:shd w:val="clear" w:color="auto" w:fill="40404A"/>
             <w:tcMar>
               <w:top w:w="100" w:type="dxa"/>
@@ -431,8 +642,6 @@
           <w:p>
             <w:pPr>
               <w:jc w:val="center"/>
-            </w:pPr>
-            <w:r>
               <w:rPr>
                 <w:b/>
                 <w:bCs/>
@@ -440,7 +649,68 @@
                 <w:sz w:val="17"/>
                 <w:szCs w:val="17"/>
               </w:rPr>
-              <w:t>TOTAL PRICE</w:t>
+            </w:pPr>
+          </w:p>
+        </w:tc>
+        <w:tc>
+          <w:tcPr>
+            <w:tcW w:w="1910" w:type="dxa"/>
+            <w:shd w:val="clear" w:color="auto" w:fill="40404A"/>
+            <w:tcMar>
+              <w:top w:w="100" w:type="dxa"/>
+              <w:left w:w="150" w:type="dxa"/>
+              <w:bottom w:w="100" w:type="dxa"/>
+              <w:right w:w="150" w:type="dxa"/>
+            </w:tcMar>
+          </w:tcPr>
+          <w:p>
+            <w:pPr>
+              <w:jc w:val="center"/>
+              <w:rPr>
+                <w:b/>
+                <w:bCs/>
+                <w:color w:val="FFFFFF"/>
+                <w:sz w:val="17"/>
+                <w:szCs w:val="17"/>
+              </w:rPr>
+            </w:pPr>
+            <w:r>
+              <w:rPr>
+                <w:b/>
+                <w:bCs/>
+                <w:color w:val="FFFFFF"/>
+                <w:sz w:val="17"/>
+                <w:szCs w:val="17"/>
+              </w:rPr>
+              <w:t>QAR</w:t>
+            </w:r>
+          </w:p>
+        </w:tc>
+        <w:tc>
+          <w:tcPr>
+            <w:tcW w:w="1910" w:type="dxa"/>
+            <w:shd w:val="clear" w:color="auto" w:fill="40404A"/>
+          </w:tcPr>
+          <w:p>
+            <w:pPr>
+              <w:jc w:val="center"/>
+              <w:rPr>
+                <w:b/>
+                <w:bCs/>
+                <w:color w:val="FFFFFF"/>
+                <w:sz w:val="17"/>
+                <w:szCs w:val="17"/>
+              </w:rPr>
+            </w:pPr>
+            <w:r>
+              <w:rPr>
+                <w:b/>
+                <w:bCs/>
+                <w:color w:val="FFFFFF"/>
+                <w:sz w:val="17"/>
+                <w:szCs w:val="17"/>
+              </w:rPr>
+              <w:t>USD</w:t>
             </w:r>
           </w:p>
         </w:tc>
@@ -451,7 +721,7 @@
         </w:trPr>
         <w:tc>
           <w:tcPr>
-            <w:tcW w:w="664" w:type="dxa"/>
+            <w:tcW w:w="720" w:type="dxa"/>
             <w:tcMar>
               <w:top w:w="100" w:type="dxa"/>
               <w:left w:w="150" w:type="dxa"/>
@@ -460,6 +730,9 @@
             </w:tcMar>
           </w:tcPr>
           <w:p>
+            <w:pPr>
+              <w:ind w:left="0" w:firstLine="0"/>
+            </w:pPr>
             <w:r>
               <w:rPr>
                 <w:sz w:val="19"/>
@@ -471,7 +744,7 @@
         </w:tc>
         <w:tc>
           <w:tcPr>
-            <w:tcW w:w="6284" w:type="dxa"/>
+            <w:tcW w:w="6228" w:type="dxa"/>
             <w:gridSpan w:val="2"/>
             <w:tcMar>
               <w:top w:w="100" w:type="dxa"/>
@@ -492,10 +765,18 @@
             </w:pPr>
             <w:r>
               <w:rPr>
+                <w:color w:val="FF0000"/>
                 <w:sz w:val="19"/>
                 <w:szCs w:val="19"/>
               </w:rPr>
-              <w:t>Ocean Freight</w:t>
+              <w:t>{MODE}</w:t>
+            </w:r>
+            <w:r>
+              <w:rPr>
+                <w:sz w:val="19"/>
+                <w:szCs w:val="19"/>
+              </w:rPr>
+              <w:t xml:space="preserve"> Freight</w:t>
             </w:r>
           </w:p>
           <w:p>
@@ -503,6 +784,7 @@
               <w:spacing w:after="0"/>
               <w:ind w:left="360"/>
               <w:rPr>
+                <w:color w:val="FF0000"/>
                 <w:sz w:val="19"/>
                 <w:szCs w:val="19"/>
               </w:rPr>
@@ -565,7 +847,7 @@
         </w:tc>
         <w:tc>
           <w:tcPr>
-            <w:tcW w:w="3820" w:type="dxa"/>
+            <w:tcW w:w="1910" w:type="dxa"/>
             <w:tcMar>
               <w:top w:w="100" w:type="dxa"/>
               <w:left w:w="150" w:type="dxa"/>
@@ -582,18 +864,48 @@
             </w:pPr>
             <w:r>
               <w:rPr>
-                <w:sz w:val="19"/>
-                <w:szCs w:val="19"/>
-              </w:rPr>
-              <w:t xml:space="preserve">QAR </w:t>
-            </w:r>
-            <w:r>
-              <w:rPr>
                 <w:color w:val="FF0000"/>
                 <w:sz w:val="19"/>
                 <w:szCs w:val="19"/>
               </w:rPr>
-              <w:t>{FREIGHT}</w:t>
+              <w:t>{FREIGHT_QAR}</w:t>
+            </w:r>
+          </w:p>
+        </w:tc>
+        <w:tc>
+          <w:tcPr>
+            <w:tcW w:w="1910" w:type="dxa"/>
+          </w:tcPr>
+          <w:p>
+            <w:pPr>
+              <w:jc w:val="center"/>
+              <w:rPr>
+                <w:color w:val="FF0000"/>
+              </w:rPr>
+            </w:pPr>
+            <w:r>
+              <w:rPr>
+                <w:color w:val="FF0000"/>
+                <w:sz w:val="19"/>
+                <w:szCs w:val="19"/>
+              </w:rPr>
+              <w:t>{FREIGHT</w:t>
+            </w:r>
+            <w:r>
+              <w:rPr>
+                <w:color w:val="FF0000"/>
+                <w:sz w:val="19"/>
+                <w:szCs w:val="19"/>
+              </w:rPr>
+              <w:t>_USD</w:t>
+            </w:r>
+            <w:r>
+              <w:rPr>
+                <w:color w:val="FF0000"/>
+                <w:sz w:val="19"/>
+                <w:szCs w:val="19"/>
+              </w:rPr>
+              <w:t>}</w:t>
             </w:r>
           </w:p>
         </w:tc>
@@ -604,7 +916,7 @@
         </w:trPr>
         <w:tc>
           <w:tcPr>
-            <w:tcW w:w="664" w:type="dxa"/>
+            <w:tcW w:w="720" w:type="dxa"/>
             <w:shd w:val="clear" w:color="auto" w:fill="F9FAFB"/>
             <w:tcMar>
               <w:top w:w="100" w:type="dxa"/>
@@ -614,6 +926,9 @@
             </w:tcMar>
           </w:tcPr>
           <w:p>
+            <w:pPr>
+              <w:ind w:left="0" w:firstLine="0"/>
+            </w:pPr>
             <w:r>
               <w:rPr>
                 <w:sz w:val="19"/>
@@ -625,7 +940,7 @@
         </w:tc>
         <w:tc>
           <w:tcPr>
-            <w:tcW w:w="5706" w:type="dxa"/>
+            <w:tcW w:w="5650" w:type="dxa"/>
             <w:shd w:val="clear" w:color="auto" w:fill="F9FAFB"/>
             <w:tcMar>
               <w:top w:w="100" w:type="dxa"/>
@@ -681,6 +996,7 @@
         <w:tc>
           <w:tcPr>
             <w:tcW w:w="3820" w:type="dxa"/>
+            <w:gridSpan w:val="2"/>
             <w:shd w:val="clear" w:color="auto" w:fill="F9FAFB"/>
             <w:tcMar>
               <w:top w:w="100" w:type="dxa"/>
@@ -698,7 +1014,7 @@
                 <w:sz w:val="19"/>
                 <w:szCs w:val="19"/>
               </w:rPr>
-              <w:t>QAR 250.00</w:t>
+              <w:t>250.00</w:t>
             </w:r>
           </w:p>
         </w:tc>
@@ -709,7 +1025,7 @@
         </w:trPr>
         <w:tc>
           <w:tcPr>
-            <w:tcW w:w="664" w:type="dxa"/>
+            <w:tcW w:w="720" w:type="dxa"/>
             <w:tcMar>
               <w:top w:w="100" w:type="dxa"/>
               <w:left w:w="150" w:type="dxa"/>
@@ -720,6 +1036,7 @@
           <w:p>
             <w:pPr>
               <w:spacing w:after="0"/>
+              <w:ind w:left="0" w:firstLine="0"/>
             </w:pPr>
             <w:r>
               <w:rPr>
@@ -732,7 +1049,7 @@
         </w:tc>
         <w:tc>
           <w:tcPr>
-            <w:tcW w:w="5706" w:type="dxa"/>
+            <w:tcW w:w="5650" w:type="dxa"/>
             <w:tcMar>
               <w:top w:w="100" w:type="dxa"/>
               <w:left w:w="150" w:type="dxa"/>
@@ -805,6 +1122,7 @@
         <w:tc>
           <w:tcPr>
             <w:tcW w:w="3820" w:type="dxa"/>
+            <w:gridSpan w:val="2"/>
             <w:tcMar>
               <w:top w:w="100" w:type="dxa"/>
               <w:left w:w="150" w:type="dxa"/>
@@ -822,13 +1140,6 @@
             </w:pPr>
             <w:r>
               <w:rPr>
-                <w:sz w:val="19"/>
-                <w:szCs w:val="19"/>
-              </w:rPr>
-              <w:t xml:space="preserve">QAR </w:t>
-            </w:r>
-            <w:r>
-              <w:rPr>
                 <w:color w:val="FF0000"/>
                 <w:sz w:val="19"/>
                 <w:szCs w:val="19"/>
@@ -844,7 +1155,7 @@
         </w:trPr>
         <w:tc>
           <w:tcPr>
-            <w:tcW w:w="664" w:type="dxa"/>
+            <w:tcW w:w="720" w:type="dxa"/>
             <w:shd w:val="clear" w:color="auto" w:fill="F9FAFB"/>
             <w:tcMar>
               <w:top w:w="100" w:type="dxa"/>
@@ -856,6 +1167,7 @@
           <w:p>
             <w:pPr>
               <w:spacing w:after="0"/>
+              <w:ind w:left="0" w:firstLine="0"/>
             </w:pPr>
             <w:r>
               <w:rPr>
@@ -868,7 +1180,7 @@
         </w:tc>
         <w:tc>
           <w:tcPr>
-            <w:tcW w:w="5706" w:type="dxa"/>
+            <w:tcW w:w="5650" w:type="dxa"/>
             <w:shd w:val="clear" w:color="auto" w:fill="F9FAFB"/>
             <w:tcMar>
               <w:top w:w="100" w:type="dxa"/>
@@ -928,6 +1240,7 @@
         <w:tc>
           <w:tcPr>
             <w:tcW w:w="3820" w:type="dxa"/>
+            <w:gridSpan w:val="2"/>
             <w:shd w:val="clear" w:color="auto" w:fill="F9FAFB"/>
             <w:tcMar>
               <w:top w:w="100" w:type="dxa"/>
@@ -957,7 +1270,7 @@
         </w:trPr>
         <w:tc>
           <w:tcPr>
-            <w:tcW w:w="664" w:type="dxa"/>
+            <w:tcW w:w="720" w:type="dxa"/>
             <w:shd w:val="clear" w:color="auto" w:fill="F9FAFB"/>
             <w:tcMar>
               <w:top w:w="100" w:type="dxa"/>
@@ -969,6 +1282,7 @@
           <w:p>
             <w:pPr>
               <w:spacing w:after="0"/>
+              <w:ind w:left="0" w:firstLine="0"/>
               <w:rPr>
                 <w:sz w:val="19"/>
                 <w:szCs w:val="19"/>
@@ -985,7 +1299,7 @@
         </w:tc>
         <w:tc>
           <w:tcPr>
-            <w:tcW w:w="5706" w:type="dxa"/>
+            <w:tcW w:w="5650" w:type="dxa"/>
             <w:shd w:val="clear" w:color="auto" w:fill="F9FAFB"/>
             <w:tcMar>
               <w:top w:w="100" w:type="dxa"/>
@@ -1032,6 +1346,7 @@
         <w:tc>
           <w:tcPr>
             <w:tcW w:w="3820" w:type="dxa"/>
+            <w:gridSpan w:val="2"/>
             <w:shd w:val="clear" w:color="auto" w:fill="F9FAFB"/>
             <w:tcMar>
               <w:top w:w="100" w:type="dxa"/>
@@ -1065,7 +1380,7 @@
         </w:trPr>
         <w:tc>
           <w:tcPr>
-            <w:tcW w:w="664" w:type="dxa"/>
+            <w:tcW w:w="720" w:type="dxa"/>
             <w:shd w:val="clear" w:color="auto" w:fill="F9FAFB"/>
             <w:tcMar>
               <w:top w:w="100" w:type="dxa"/>
@@ -1077,6 +1392,7 @@
           <w:p>
             <w:pPr>
               <w:spacing w:after="0"/>
+              <w:ind w:left="0" w:firstLine="0"/>
               <w:rPr>
                 <w:sz w:val="19"/>
                 <w:szCs w:val="19"/>
@@ -1093,7 +1409,7 @@
         </w:tc>
         <w:tc>
           <w:tcPr>
-            <w:tcW w:w="5706" w:type="dxa"/>
+            <w:tcW w:w="5650" w:type="dxa"/>
             <w:shd w:val="clear" w:color="auto" w:fill="F9FAFB"/>
             <w:tcMar>
               <w:top w:w="100" w:type="dxa"/>
@@ -1140,6 +1456,7 @@
         <w:tc>
           <w:tcPr>
             <w:tcW w:w="3820" w:type="dxa"/>
+            <w:gridSpan w:val="2"/>
             <w:shd w:val="clear" w:color="auto" w:fill="F9FAFB"/>
             <w:tcMar>
               <w:top w:w="100" w:type="dxa"/>
@@ -1209,6 +1526,7 @@
         <w:tc>
           <w:tcPr>
             <w:tcW w:w="3820" w:type="dxa"/>
+            <w:gridSpan w:val="2"/>
             <w:shd w:val="clear" w:color="auto" w:fill="F9FAFB"/>
             <w:tcMar>
               <w:top w:w="100" w:type="dxa"/>
@@ -1227,6 +1545,8 @@
             </w:pPr>
             <w:r>
               <w:rPr>
+                <w:b/>
+                <w:bCs/>
                 <w:color w:val="FF0000"/>
                 <w:sz w:val="19"/>
                 <w:szCs w:val="19"/>
@@ -1235,10 +1555,12 @@
             </w:r>
             <w:r>
               <w:rPr>
+                <w:b/>
+                <w:bCs/>
                 <w:sz w:val="19"/>
                 <w:szCs w:val="19"/>
               </w:rPr>
-              <w:t xml:space="preserve"> + DUTY</w:t>
+              <w:t xml:space="preserve"> </w:t>
             </w:r>
           </w:p>
         </w:tc>
@@ -1256,16 +1578,9 @@
     </w:p>
     <w:p>
       <w:pPr>
-        <w:ind w:left="0" w:firstLine="0"/>
-        <w:rPr>
-          <w:b/>
-          <w:bCs/>
-          <w:color w:val="B8935A"/>
-        </w:rPr>
-      </w:pPr>
-    </w:p>
-    <w:p>
-      <w:pPr>
+        <w:spacing w:before="240"/>
+        <w:ind w:left="360"/>
+        <w:jc w:val="both"/>
         <w:rPr>
           <w:sz w:val="18"/>
           <w:szCs w:val="18"/>
@@ -1283,10 +1598,27 @@
       </w:r>
       <w:r>
         <w:rPr>
+          <w:color w:val="auto"/>
           <w:sz w:val="18"/>
           <w:szCs w:val="18"/>
         </w:rPr>
-        <w:t>Shipping line charges, port charges, and customs duties will be charged at actuals as per Bayan. Rates are valid for general cargo only. If any HS code requires special approval, the consignee must arrange it.</w:t>
+        <w:t>Shipping line charges, port handling fees, and customs duties will be billed based on actual costs, per Bayan.</w:t>
+      </w:r>
+      <w:r>
+        <w:rPr>
+          <w:color w:val="auto"/>
+          <w:sz w:val="18"/>
+          <w:szCs w:val="18"/>
+        </w:rPr>
+        <w:t xml:space="preserve"> </w:t>
+      </w:r>
+      <w:r>
+        <w:rPr>
+          <w:color w:val="auto"/>
+          <w:sz w:val="18"/>
+          <w:szCs w:val="18"/>
+        </w:rPr>
+        <w:t>The quoted rates apply strictly to general cargo. If any HS code requires special approval or regulatory clearance, it will be the consignee’s responsibility to obtain and arrange the necessary approvals.</w:t>
       </w:r>
     </w:p>
     <w:p>
@@ -1315,7 +1647,6 @@
           <w:bCs/>
           <w:u w:val="single"/>
         </w:rPr>
-        <w:lastRenderedPageBreak/>
         <w:t>TERMS AND CONDITIONS</w:t>
       </w:r>
     </w:p>
@@ -2312,7 +2643,25 @@
           <w:sz w:val="13"/>
           <w:szCs w:val="13"/>
         </w:rPr>
-        <w:t>Palletization Mandate: In strict compliance with regulatory mandates at Hamad Port and regional Qatari customs entry points, all cargo must be properly palletized prior to presentation for clearance. Failure to comply will result in regulatory fines, manual destuffing fees, and clearance delays passed back entirely to the client.</w:t>
+        <w:t xml:space="preserve">Palletization Mandate: In strict compliance with regulatory mandates at Hamad Port and regional Qatari customs entry points, all cargo must be properly palletized </w:t>
+      </w:r>
+      <w:r>
+        <w:rPr>
+          <w:b/>
+          <w:bCs/>
+          <w:sz w:val="13"/>
+          <w:szCs w:val="13"/>
+        </w:rPr>
+        <w:t>before</w:t>
+      </w:r>
+      <w:r>
+        <w:rPr>
+          <w:b/>
+          <w:bCs/>
+          <w:sz w:val="13"/>
+          <w:szCs w:val="13"/>
+        </w:rPr>
+        <w:t xml:space="preserve"> presentation for clearance. Failure to comply will result in regulatory fines, manual destuffing fees, and clearance delays passed back entirely to the client.</w:t>
       </w:r>
     </w:p>
     <w:p>
@@ -2362,7 +2711,27 @@
           <w:sz w:val="13"/>
           <w:szCs w:val="13"/>
         </w:rPr>
-        <w:t>Clearance Documentation: The consignee is legally obligated to submit all authentic original documents required for customs clearance, including but not limited to: a Certificate of Origin (COO), and a Chamber of Commerce-attested Commercial Invoice and Packing List.</w:t>
+        <w:t xml:space="preserve">Clearance Documentation: The consignee is legally obligated to submit all authentic original documents required for customs clearance, including but not limited to: </w:t>
+      </w:r>
+      <w:proofErr w:type="gramStart"/>
+      <w:r>
+        <w:rPr>
+          <w:b/>
+          <w:bCs/>
+          <w:sz w:val="13"/>
+          <w:szCs w:val="13"/>
+        </w:rPr>
+        <w:t>a</w:t>
+      </w:r>
+      <w:proofErr w:type="gramEnd"/>
+      <w:r>
+        <w:rPr>
+          <w:b/>
+          <w:bCs/>
+          <w:sz w:val="13"/>
+          <w:szCs w:val="13"/>
+        </w:rPr>
+        <w:t xml:space="preserve"> Certificate of Origin (COO), and a Chamber of Commerce-attested Commercial Invoice and Packing List.</w:t>
       </w:r>
     </w:p>
     <w:p>
@@ -2495,7 +2864,7 @@
 </file>
 
 <file path=word/endnotes.xml><?xml version="1.0" encoding="utf-8"?>
-<w:endnotes xmlns:wpc="http://schemas.microsoft.com/office/word/2010/wordprocessingCanvas" xmlns:cx="http://schemas.microsoft.com/office/drawing/2014/chartex" xmlns:cx1="http://schemas.microsoft.com/office/drawing/2015/9/8/chartex" xmlns:cx2="http://schemas.microsoft.com/office/drawing/2015/10/21/chartex" xmlns:cx3="http://schemas.microsoft.com/office/drawing/2016/5/9/chartex" xmlns:cx4="http://schemas.microsoft.com/office/drawing/2016/5/10/chartex" xmlns:cx5="http://schemas.microsoft.com/office/drawing/2016/5/11/chartex" xmlns:cx6="http://schemas.microsoft.com/office/drawing/2016/5/12/chartex" xmlns:cx7="http://schemas.microsoft.com/office/drawing/2016/5/13/chartex" xmlns:cx8="http://schemas.microsoft.com/office/drawing/2016/5/14/chartex" xmlns:mc="http://schemas.openxmlformats.org/markup-compatibility/2006" xmlns:aink="http://schemas.microsoft.com/office/drawing/2016/ink" xmlns:am3d="http://schemas.microsoft.com/office/drawing/2017/model3d" xmlns:o="urn:schemas-microsoft-com:office:office" xmlns:oel="http://schemas.microsoft.com/office/2019/extlst" xmlns:r="http://schemas.openxmlformats.org/officeDocument/2006/relationships" xmlns:m="http://schemas.openxmlformats.org/officeDocument/2006/math" xmlns:v="urn:schemas-microsoft-com:vml" xmlns:wp14="http://schemas.microsoft.com/office/word/2010/wordprocessingDrawing" xmlns:wp="http://schemas.openxmlformats.org/drawingml/2006/wordprocessingDrawing" xmlns:w10="urn:schemas-microsoft-com:office:word" xmlns:w="http://schemas.openxmlformats.org/wordprocessingml/2006/main" xmlns:w14="http://schemas.microsoft.com/office/word/2010/wordml" xmlns:w15="http://schemas.microsoft.com/office/word/2012/wordml" xmlns:w16cex="http://schemas.microsoft.com/office/word/2018/wordml/cex" xmlns:w16cid="http://schemas.microsoft.com/office/word/2016/wordml/cid" xmlns:w16="http://schemas.microsoft.com/office/word/2018/wordml" xmlns:w16du="http://schemas.microsoft.com/office/word/2023/wordml/word16du" xmlns:w16sdtdh="http://schemas.microsoft.com/office/word/2020/wordml/sdtdatahash" xmlns:w16sdtfl="http://schemas.microsoft.com/office/word/2024/wordml/sdtformatlock" xmlns:w16se="http://schemas.microsoft.com/office/word/2015/wordml/symex" xmlns:wpg="http://schemas.microsoft.com/office/word/2010/wordprocessingGroup" xmlns:wpi="http://schemas.microsoft.com/office/word/2010/wordprocessingInk" xmlns:wne="http://schemas.microsoft.com/office/word/2006/wordml" xmlns:wps="http://schemas.microsoft.com/office/word/2010/wordprocessingShape" mc:Ignorable="w14 w15 w16se w16cid w16 w16cex w16sdtdh w16sdtfl w16du wp14">
+<w:endnotes xmlns:wpc="http://schemas.microsoft.com/office/word/2010/wordprocessingCanvas" xmlns:cx="http://schemas.microsoft.com/office/drawing/2014/chartex" xmlns:cx1="http://schemas.microsoft.com/office/drawing/2015/9/8/chartex" xmlns:cx2="http://schemas.microsoft.com/office/drawing/2015/10/21/chartex" xmlns:cx3="http://schemas.microsoft.com/office/drawing/2016/5/9/chartex" xmlns:cx4="http://schemas.microsoft.com/office/drawing/2016/5/10/chartex" xmlns:cx5="http://schemas.microsoft.com/office/drawing/2016/5/11/chartex" xmlns:cx6="http://schemas.microsoft.com/office/drawing/2016/5/12/chartex" xmlns:cx7="http://schemas.microsoft.com/office/drawing/2016/5/13/chartex" xmlns:cx8="http://schemas.microsoft.com/office/drawing/2016/5/14/chartex" xmlns:mc="http://schemas.openxmlformats.org/markup-compatibility/2006" xmlns:aink="http://schemas.microsoft.com/office/drawing/2016/ink" xmlns:am3d="http://schemas.microsoft.com/office/drawing/2017/model3d" xmlns:o="urn:schemas-microsoft-com:office:office" xmlns:r="http://schemas.openxmlformats.org/officeDocument/2006/relationships" xmlns:m="http://schemas.openxmlformats.org/officeDocument/2006/math" xmlns:v="urn:schemas-microsoft-com:vml" xmlns:wp14="http://schemas.microsoft.com/office/word/2010/wordprocessingDrawing" xmlns:wp="http://schemas.openxmlformats.org/drawingml/2006/wordprocessingDrawing" xmlns:w10="urn:schemas-microsoft-com:office:word" xmlns:w="http://schemas.openxmlformats.org/wordprocessingml/2006/main" xmlns:w14="http://schemas.microsoft.com/office/word/2010/wordml" xmlns:w15="http://schemas.microsoft.com/office/word/2012/wordml" xmlns:w16cex="http://schemas.microsoft.com/office/word/2018/wordml/cex" xmlns:w16cid="http://schemas.microsoft.com/office/word/2016/wordml/cid" xmlns:w16="http://schemas.microsoft.com/office/word/2018/wordml" xmlns:w16se="http://schemas.microsoft.com/office/word/2015/wordml/symex" xmlns:wpg="http://schemas.microsoft.com/office/word/2010/wordprocessingGroup" xmlns:wpi="http://schemas.microsoft.com/office/word/2010/wordprocessingInk" xmlns:wne="http://schemas.microsoft.com/office/word/2006/wordml" xmlns:wps="http://schemas.microsoft.com/office/word/2010/wordprocessingShape" mc:Ignorable="w14 w15 w16se w16cid w16 w16cex wp14">
   <w:endnote w:type="separator" w:id="-1">
     <w:p>
       <w:pPr>
@@ -2520,7 +2889,7 @@
 </file>
 
 <file path=word/footer1.xml><?xml version="1.0" encoding="utf-8"?>
-<w:ftr xmlns:wpc="http://schemas.microsoft.com/office/word/2010/wordprocessingCanvas" xmlns:cx="http://schemas.microsoft.com/office/drawing/2014/chartex" xmlns:cx1="http://schemas.microsoft.com/office/drawing/2015/9/8/chartex" xmlns:cx2="http://schemas.microsoft.com/office/drawing/2015/10/21/chartex" xmlns:cx3="http://schemas.microsoft.com/office/drawing/2016/5/9/chartex" xmlns:cx4="http://schemas.microsoft.com/office/drawing/2016/5/10/chartex" xmlns:cx5="http://schemas.microsoft.com/office/drawing/2016/5/11/chartex" xmlns:cx6="http://schemas.microsoft.com/office/drawing/2016/5/12/chartex" xmlns:cx7="http://schemas.microsoft.com/office/drawing/2016/5/13/chartex" xmlns:cx8="http://schemas.microsoft.com/office/drawing/2016/5/14/chartex" xmlns:mc="http://schemas.openxmlformats.org/markup-compatibility/2006" xmlns:aink="http://schemas.microsoft.com/office/drawing/2016/ink" xmlns:am3d="http://schemas.microsoft.com/office/drawing/2017/model3d" xmlns:o="urn:schemas-microsoft-com:office:office" xmlns:oel="http://schemas.microsoft.com/office/2019/extlst" xmlns:r="http://schemas.openxmlformats.org/officeDocument/2006/relationships" xmlns:m="http://schemas.openxmlformats.org/officeDocument/2006/math" xmlns:v="urn:schemas-microsoft-com:vml" xmlns:wp14="http://schemas.microsoft.com/office/word/2010/wordprocessingDrawing" xmlns:wp="http://schemas.openxmlformats.org/drawingml/2006/wordprocessingDrawing" xmlns:w10="urn:schemas-microsoft-com:office:word" xmlns:w="http://schemas.openxmlformats.org/wordprocessingml/2006/main" xmlns:w14="http://schemas.microsoft.com/office/word/2010/wordml" xmlns:w15="http://schemas.microsoft.com/office/word/2012/wordml" xmlns:w16cex="http://schemas.microsoft.com/office/word/2018/wordml/cex" xmlns:w16cid="http://schemas.microsoft.com/office/word/2016/wordml/cid" xmlns:w16="http://schemas.microsoft.com/office/word/2018/wordml" xmlns:w16du="http://schemas.microsoft.com/office/word/2023/wordml/word16du" xmlns:w16sdtdh="http://schemas.microsoft.com/office/word/2020/wordml/sdtdatahash" xmlns:w16sdtfl="http://schemas.microsoft.com/office/word/2024/wordml/sdtformatlock" xmlns:w16se="http://schemas.microsoft.com/office/word/2015/wordml/symex" xmlns:wpg="http://schemas.microsoft.com/office/word/2010/wordprocessingGroup" xmlns:wpi="http://schemas.microsoft.com/office/word/2010/wordprocessingInk" xmlns:wne="http://schemas.microsoft.com/office/word/2006/wordml" xmlns:wps="http://schemas.microsoft.com/office/word/2010/wordprocessingShape" mc:Ignorable="w14 w15 w16se w16cid w16 w16cex w16sdtdh w16sdtfl w16du wp14">
+<w:ftr xmlns:wpc="http://schemas.microsoft.com/office/word/2010/wordprocessingCanvas" xmlns:cx="http://schemas.microsoft.com/office/drawing/2014/chartex" xmlns:cx1="http://schemas.microsoft.com/office/drawing/2015/9/8/chartex" xmlns:cx2="http://schemas.microsoft.com/office/drawing/2015/10/21/chartex" xmlns:cx3="http://schemas.microsoft.com/office/drawing/2016/5/9/chartex" xmlns:cx4="http://schemas.microsoft.com/office/drawing/2016/5/10/chartex" xmlns:cx5="http://schemas.microsoft.com/office/drawing/2016/5/11/chartex" xmlns:cx6="http://schemas.microsoft.com/office/drawing/2016/5/12/chartex" xmlns:cx7="http://schemas.microsoft.com/office/drawing/2016/5/13/chartex" xmlns:cx8="http://schemas.microsoft.com/office/drawing/2016/5/14/chartex" xmlns:mc="http://schemas.openxmlformats.org/markup-compatibility/2006" xmlns:aink="http://schemas.microsoft.com/office/drawing/2016/ink" xmlns:am3d="http://schemas.microsoft.com/office/drawing/2017/model3d" xmlns:o="urn:schemas-microsoft-com:office:office" xmlns:r="http://schemas.openxmlformats.org/officeDocument/2006/relationships" xmlns:m="http://schemas.openxmlformats.org/officeDocument/2006/math" xmlns:v="urn:schemas-microsoft-com:vml" xmlns:wp14="http://schemas.microsoft.com/office/word/2010/wordprocessingDrawing" xmlns:wp="http://schemas.openxmlformats.org/drawingml/2006/wordprocessingDrawing" xmlns:w10="urn:schemas-microsoft-com:office:word" xmlns:w="http://schemas.openxmlformats.org/wordprocessingml/2006/main" xmlns:w14="http://schemas.microsoft.com/office/word/2010/wordml" xmlns:w15="http://schemas.microsoft.com/office/word/2012/wordml" xmlns:w16cex="http://schemas.microsoft.com/office/word/2018/wordml/cex" xmlns:w16cid="http://schemas.microsoft.com/office/word/2016/wordml/cid" xmlns:w16="http://schemas.microsoft.com/office/word/2018/wordml" xmlns:w16se="http://schemas.microsoft.com/office/word/2015/wordml/symex" xmlns:wpg="http://schemas.microsoft.com/office/word/2010/wordprocessingGroup" xmlns:wpi="http://schemas.microsoft.com/office/word/2010/wordprocessingInk" xmlns:wne="http://schemas.microsoft.com/office/word/2006/wordml" xmlns:wps="http://schemas.microsoft.com/office/word/2010/wordprocessingShape" mc:Ignorable="w14 w15 w16se w16cid w16 w16cex wp14">
   <w:p>
     <w:pPr>
       <w:ind w:left="0" w:firstLine="0"/>
@@ -2578,7 +2947,7 @@
 </file>
 
 <file path=word/footnotes.xml><?xml version="1.0" encoding="utf-8"?>
-<w:footnotes xmlns:wpc="http://schemas.microsoft.com/office/word/2010/wordprocessingCanvas" xmlns:cx="http://schemas.microsoft.com/office/drawing/2014/chartex" xmlns:cx1="http://schemas.microsoft.com/office/drawing/2015/9/8/chartex" xmlns:cx2="http://schemas.microsoft.com/office/drawing/2015/10/21/chartex" xmlns:cx3="http://schemas.microsoft.com/office/drawing/2016/5/9/chartex" xmlns:cx4="http://schemas.microsoft.com/office/drawing/2016/5/10/chartex" xmlns:cx5="http://schemas.microsoft.com/office/drawing/2016/5/11/chartex" xmlns:cx6="http://schemas.microsoft.com/office/drawing/2016/5/12/chartex" xmlns:cx7="http://schemas.microsoft.com/office/drawing/2016/5/13/chartex" xmlns:cx8="http://schemas.microsoft.com/office/drawing/2016/5/14/chartex" xmlns:mc="http://schemas.openxmlformats.org/markup-compatibility/2006" xmlns:aink="http://schemas.microsoft.com/office/drawing/2016/ink" xmlns:am3d="http://schemas.microsoft.com/office/drawing/2017/model3d" xmlns:o="urn:schemas-microsoft-com:office:office" xmlns:oel="http://schemas.microsoft.com/office/2019/extlst" xmlns:r="http://schemas.openxmlformats.org/officeDocument/2006/relationships" xmlns:m="http://schemas.openxmlformats.org/officeDocument/2006/math" xmlns:v="urn:schemas-microsoft-com:vml" xmlns:wp14="http://schemas.microsoft.com/office/word/2010/wordprocessingDrawing" xmlns:wp="http://schemas.openxmlformats.org/drawingml/2006/wordprocessingDrawing" xmlns:w10="urn:schemas-microsoft-com:office:word" xmlns:w="http://schemas.openxmlformats.org/wordprocessingml/2006/main" xmlns:w14="http://schemas.microsoft.com/office/word/2010/wordml" xmlns:w15="http://schemas.microsoft.com/office/word/2012/wordml" xmlns:w16cex="http://schemas.microsoft.com/office/word/2018/wordml/cex" xmlns:w16cid="http://schemas.microsoft.com/office/word/2016/wordml/cid" xmlns:w16="http://schemas.microsoft.com/office/word/2018/wordml" xmlns:w16du="http://schemas.microsoft.com/office/word/2023/wordml/word16du" xmlns:w16sdtdh="http://schemas.microsoft.com/office/word/2020/wordml/sdtdatahash" xmlns:w16sdtfl="http://schemas.microsoft.com/office/word/2024/wordml/sdtformatlock" xmlns:w16se="http://schemas.microsoft.com/office/word/2015/wordml/symex" xmlns:wpg="http://schemas.microsoft.com/office/word/2010/wordprocessingGroup" xmlns:wpi="http://schemas.microsoft.com/office/word/2010/wordprocessingInk" xmlns:wne="http://schemas.microsoft.com/office/word/2006/wordml" xmlns:wps="http://schemas.microsoft.com/office/word/2010/wordprocessingShape" mc:Ignorable="w14 w15 w16se w16cid w16 w16cex w16sdtdh w16sdtfl w16du wp14">
+<w:footnotes xmlns:wpc="http://schemas.microsoft.com/office/word/2010/wordprocessingCanvas" xmlns:cx="http://schemas.microsoft.com/office/drawing/2014/chartex" xmlns:cx1="http://schemas.microsoft.com/office/drawing/2015/9/8/chartex" xmlns:cx2="http://schemas.microsoft.com/office/drawing/2015/10/21/chartex" xmlns:cx3="http://schemas.microsoft.com/office/drawing/2016/5/9/chartex" xmlns:cx4="http://schemas.microsoft.com/office/drawing/2016/5/10/chartex" xmlns:cx5="http://schemas.microsoft.com/office/drawing/2016/5/11/chartex" xmlns:cx6="http://schemas.microsoft.com/office/drawing/2016/5/12/chartex" xmlns:cx7="http://schemas.microsoft.com/office/drawing/2016/5/13/chartex" xmlns:cx8="http://schemas.microsoft.com/office/drawing/2016/5/14/chartex" xmlns:mc="http://schemas.openxmlformats.org/markup-compatibility/2006" xmlns:aink="http://schemas.microsoft.com/office/drawing/2016/ink" xmlns:am3d="http://schemas.microsoft.com/office/drawing/2017/model3d" xmlns:o="urn:schemas-microsoft-com:office:office" xmlns:r="http://schemas.openxmlformats.org/officeDocument/2006/relationships" xmlns:m="http://schemas.openxmlformats.org/officeDocument/2006/math" xmlns:v="urn:schemas-microsoft-com:vml" xmlns:wp14="http://schemas.microsoft.com/office/word/2010/wordprocessingDrawing" xmlns:wp="http://schemas.openxmlformats.org/drawingml/2006/wordprocessingDrawing" xmlns:w10="urn:schemas-microsoft-com:office:word" xmlns:w="http://schemas.openxmlformats.org/wordprocessingml/2006/main" xmlns:w14="http://schemas.microsoft.com/office/word/2010/wordml" xmlns:w15="http://schemas.microsoft.com/office/word/2012/wordml" xmlns:w16cex="http://schemas.microsoft.com/office/word/2018/wordml/cex" xmlns:w16cid="http://schemas.microsoft.com/office/word/2016/wordml/cid" xmlns:w16="http://schemas.microsoft.com/office/word/2018/wordml" xmlns:w16se="http://schemas.microsoft.com/office/word/2015/wordml/symex" xmlns:wpg="http://schemas.microsoft.com/office/word/2010/wordprocessingGroup" xmlns:wpi="http://schemas.microsoft.com/office/word/2010/wordprocessingInk" xmlns:wne="http://schemas.microsoft.com/office/word/2006/wordml" xmlns:wps="http://schemas.microsoft.com/office/word/2010/wordprocessingShape" mc:Ignorable="w14 w15 w16se w16cid w16 w16cex wp14">
   <w:footnote w:type="separator" w:id="-1">
     <w:p>
       <w:pPr>
@@ -2603,7 +2972,7 @@
 </file>
 
 <file path=word/header1.xml><?xml version="1.0" encoding="utf-8"?>
-<w:hdr xmlns:wpc="http://schemas.microsoft.com/office/word/2010/wordprocessingCanvas" xmlns:cx="http://schemas.microsoft.com/office/drawing/2014/chartex" xmlns:cx1="http://schemas.microsoft.com/office/drawing/2015/9/8/chartex" xmlns:cx2="http://schemas.microsoft.com/office/drawing/2015/10/21/chartex" xmlns:cx3="http://schemas.microsoft.com/office/drawing/2016/5/9/chartex" xmlns:cx4="http://schemas.microsoft.com/office/drawing/2016/5/10/chartex" xmlns:cx5="http://schemas.microsoft.com/office/drawing/2016/5/11/chartex" xmlns:cx6="http://schemas.microsoft.com/office/drawing/2016/5/12/chartex" xmlns:cx7="http://schemas.microsoft.com/office/drawing/2016/5/13/chartex" xmlns:cx8="http://schemas.microsoft.com/office/drawing/2016/5/14/chartex" xmlns:mc="http://schemas.openxmlformats.org/markup-compatibility/2006" xmlns:aink="http://schemas.microsoft.com/office/drawing/2016/ink" xmlns:am3d="http://schemas.microsoft.com/office/drawing/2017/model3d" xmlns:o="urn:schemas-microsoft-com:office:office" xmlns:oel="http://schemas.microsoft.com/office/2019/extlst" xmlns:r="http://schemas.openxmlformats.org/officeDocument/2006/relationships" xmlns:m="http://schemas.openxmlformats.org/officeDocument/2006/math" xmlns:v="urn:schemas-microsoft-com:vml" xmlns:wp14="http://schemas.microsoft.com/office/word/2010/wordprocessingDrawing" xmlns:wp="http://schemas.openxmlformats.org/drawingml/2006/wordprocessingDrawing" xmlns:w10="urn:schemas-microsoft-com:office:word" xmlns:w="http://schemas.openxmlformats.org/wordprocessingml/2006/main" xmlns:w14="http://schemas.microsoft.com/office/word/2010/wordml" xmlns:w15="http://schemas.microsoft.com/office/word/2012/wordml" xmlns:w16cex="http://schemas.microsoft.com/office/word/2018/wordml/cex" xmlns:w16cid="http://schemas.microsoft.com/office/word/2016/wordml/cid" xmlns:w16="http://schemas.microsoft.com/office/word/2018/wordml" xmlns:w16du="http://schemas.microsoft.com/office/word/2023/wordml/word16du" xmlns:w16sdtdh="http://schemas.microsoft.com/office/word/2020/wordml/sdtdatahash" xmlns:w16sdtfl="http://schemas.microsoft.com/office/word/2024/wordml/sdtformatlock" xmlns:w16se="http://schemas.microsoft.com/office/word/2015/wordml/symex" xmlns:wpg="http://schemas.microsoft.com/office/word/2010/wordprocessingGroup" xmlns:wpi="http://schemas.microsoft.com/office/word/2010/wordprocessingInk" xmlns:wne="http://schemas.microsoft.com/office/word/2006/wordml" xmlns:wps="http://schemas.microsoft.com/office/word/2010/wordprocessingShape" mc:Ignorable="w14 w15 w16se w16cid w16 w16cex w16sdtdh w16sdtfl w16du wp14">
+<w:hdr xmlns:wpc="http://schemas.microsoft.com/office/word/2010/wordprocessingCanvas" xmlns:cx="http://schemas.microsoft.com/office/drawing/2014/chartex" xmlns:cx1="http://schemas.microsoft.com/office/drawing/2015/9/8/chartex" xmlns:cx2="http://schemas.microsoft.com/office/drawing/2015/10/21/chartex" xmlns:cx3="http://schemas.microsoft.com/office/drawing/2016/5/9/chartex" xmlns:cx4="http://schemas.microsoft.com/office/drawing/2016/5/10/chartex" xmlns:cx5="http://schemas.microsoft.com/office/drawing/2016/5/11/chartex" xmlns:cx6="http://schemas.microsoft.com/office/drawing/2016/5/12/chartex" xmlns:cx7="http://schemas.microsoft.com/office/drawing/2016/5/13/chartex" xmlns:cx8="http://schemas.microsoft.com/office/drawing/2016/5/14/chartex" xmlns:mc="http://schemas.openxmlformats.org/markup-compatibility/2006" xmlns:aink="http://schemas.microsoft.com/office/drawing/2016/ink" xmlns:am3d="http://schemas.microsoft.com/office/drawing/2017/model3d" xmlns:o="urn:schemas-microsoft-com:office:office" xmlns:r="http://schemas.openxmlformats.org/officeDocument/2006/relationships" xmlns:m="http://schemas.openxmlformats.org/officeDocument/2006/math" xmlns:v="urn:schemas-microsoft-com:vml" xmlns:wp14="http://schemas.microsoft.com/office/word/2010/wordprocessingDrawing" xmlns:wp="http://schemas.openxmlformats.org/drawingml/2006/wordprocessingDrawing" xmlns:w10="urn:schemas-microsoft-com:office:word" xmlns:w="http://schemas.openxmlformats.org/wordprocessingml/2006/main" xmlns:w14="http://schemas.microsoft.com/office/word/2010/wordml" xmlns:w15="http://schemas.microsoft.com/office/word/2012/wordml" xmlns:w16cex="http://schemas.microsoft.com/office/word/2018/wordml/cex" xmlns:w16cid="http://schemas.microsoft.com/office/word/2016/wordml/cid" xmlns:w16="http://schemas.microsoft.com/office/word/2018/wordml" xmlns:w16se="http://schemas.microsoft.com/office/word/2015/wordml/symex" xmlns:wpg="http://schemas.microsoft.com/office/word/2010/wordprocessingGroup" xmlns:wpi="http://schemas.microsoft.com/office/word/2010/wordprocessingInk" xmlns:wne="http://schemas.microsoft.com/office/word/2006/wordml" xmlns:wps="http://schemas.microsoft.com/office/word/2010/wordprocessingShape" mc:Ignorable="w14 w15 w16se w16cid w16 w16cex wp14">
   <w:p>
     <w:r>
       <w:rPr>
@@ -2706,7 +3075,7 @@
 </file>
 
 <file path=word/numbering.xml><?xml version="1.0" encoding="utf-8"?>
-<w:numbering xmlns:wpc="http://schemas.microsoft.com/office/word/2010/wordprocessingCanvas" xmlns:cx="http://schemas.microsoft.com/office/drawing/2014/chartex" xmlns:cx1="http://schemas.microsoft.com/office/drawing/2015/9/8/chartex" xmlns:cx2="http://schemas.microsoft.com/office/drawing/2015/10/21/chartex" xmlns:cx3="http://schemas.microsoft.com/office/drawing/2016/5/9/chartex" xmlns:cx4="http://schemas.microsoft.com/office/drawing/2016/5/10/chartex" xmlns:cx5="http://schemas.microsoft.com/office/drawing/2016/5/11/chartex" xmlns:cx6="http://schemas.microsoft.com/office/drawing/2016/5/12/chartex" xmlns:cx7="http://schemas.microsoft.com/office/drawing/2016/5/13/chartex" xmlns:cx8="http://schemas.microsoft.com/office/drawing/2016/5/14/chartex" xmlns:mc="http://schemas.openxmlformats.org/markup-compatibility/2006" xmlns:aink="http://schemas.microsoft.com/office/drawing/2016/ink" xmlns:am3d="http://schemas.microsoft.com/office/drawing/2017/model3d" xmlns:o="urn:schemas-microsoft-com:office:office" xmlns:oel="http://schemas.microsoft.com/office/2019/extlst" xmlns:r="http://schemas.openxmlformats.org/officeDocument/2006/relationships" xmlns:m="http://schemas.openxmlformats.org/officeDocument/2006/math" xmlns:v="urn:schemas-microsoft-com:vml" xmlns:wp14="http://schemas.microsoft.com/office/word/2010/wordprocessingDrawing" xmlns:wp="http://schemas.openxmlformats.org/drawingml/2006/wordprocessingDrawing" xmlns:w10="urn:schemas-microsoft-com:office:word" xmlns:w="http://schemas.openxmlformats.org/wordprocessingml/2006/main" xmlns:w14="http://schemas.microsoft.com/office/word/2010/wordml" xmlns:w15="http://schemas.microsoft.com/office/word/2012/wordml" xmlns:w16cex="http://schemas.microsoft.com/office/word/2018/wordml/cex" xmlns:w16cid="http://schemas.microsoft.com/office/word/2016/wordml/cid" xmlns:w16="http://schemas.microsoft.com/office/word/2018/wordml" xmlns:w16du="http://schemas.microsoft.com/office/word/2023/wordml/word16du" xmlns:w16sdtdh="http://schemas.microsoft.com/office/word/2020/wordml/sdtdatahash" xmlns:w16sdtfl="http://schemas.microsoft.com/office/word/2024/wordml/sdtformatlock" xmlns:w16se="http://schemas.microsoft.com/office/word/2015/wordml/symex" xmlns:wpg="http://schemas.microsoft.com/office/word/2010/wordprocessingGroup" xmlns:wpi="http://schemas.microsoft.com/office/word/2010/wordprocessingInk" xmlns:wne="http://schemas.microsoft.com/office/word/2006/wordml" xmlns:wps="http://schemas.microsoft.com/office/word/2010/wordprocessingShape" mc:Ignorable="w14 w15 w16se w16cid w16 w16cex w16sdtdh w16sdtfl w16du wp14">
+<w:numbering xmlns:wpc="http://schemas.microsoft.com/office/word/2010/wordprocessingCanvas" xmlns:cx="http://schemas.microsoft.com/office/drawing/2014/chartex" xmlns:cx1="http://schemas.microsoft.com/office/drawing/2015/9/8/chartex" xmlns:cx2="http://schemas.microsoft.com/office/drawing/2015/10/21/chartex" xmlns:cx3="http://schemas.microsoft.com/office/drawing/2016/5/9/chartex" xmlns:cx4="http://schemas.microsoft.com/office/drawing/2016/5/10/chartex" xmlns:cx5="http://schemas.microsoft.com/office/drawing/2016/5/11/chartex" xmlns:cx6="http://schemas.microsoft.com/office/drawing/2016/5/12/chartex" xmlns:cx7="http://schemas.microsoft.com/office/drawing/2016/5/13/chartex" xmlns:cx8="http://schemas.microsoft.com/office/drawing/2016/5/14/chartex" xmlns:mc="http://schemas.openxmlformats.org/markup-compatibility/2006" xmlns:aink="http://schemas.microsoft.com/office/drawing/2016/ink" xmlns:am3d="http://schemas.microsoft.com/office/drawing/2017/model3d" xmlns:o="urn:schemas-microsoft-com:office:office" xmlns:r="http://schemas.openxmlformats.org/officeDocument/2006/relationships" xmlns:m="http://schemas.openxmlformats.org/officeDocument/2006/math" xmlns:v="urn:schemas-microsoft-com:vml" xmlns:wp14="http://schemas.microsoft.com/office/word/2010/wordprocessingDrawing" xmlns:wp="http://schemas.openxmlformats.org/drawingml/2006/wordprocessingDrawing" xmlns:w10="urn:schemas-microsoft-com:office:word" xmlns:w="http://schemas.openxmlformats.org/wordprocessingml/2006/main" xmlns:w14="http://schemas.microsoft.com/office/word/2010/wordml" xmlns:w15="http://schemas.microsoft.com/office/word/2012/wordml" xmlns:w16cex="http://schemas.microsoft.com/office/word/2018/wordml/cex" xmlns:w16cid="http://schemas.microsoft.com/office/word/2016/wordml/cid" xmlns:w16="http://schemas.microsoft.com/office/word/2018/wordml" xmlns:w16se="http://schemas.microsoft.com/office/word/2015/wordml/symex" xmlns:wpg="http://schemas.microsoft.com/office/word/2010/wordprocessingGroup" xmlns:wpi="http://schemas.microsoft.com/office/word/2010/wordprocessingInk" xmlns:wne="http://schemas.microsoft.com/office/word/2006/wordml" xmlns:wps="http://schemas.microsoft.com/office/word/2010/wordprocessingShape" mc:Ignorable="w14 w15 w16se w16cid w16 w16cex wp14">
   <w:abstractNum w:abstractNumId="0" w15:restartNumberingAfterBreak="0">
     <w:nsid w:val="0A6B6F25"/>
     <w:multiLevelType w:val="multilevel"/>
@@ -3837,41 +4206,41 @@
       </w:rPr>
     </w:lvl>
   </w:abstractNum>
-  <w:num w:numId="1" w16cid:durableId="587158395">
+  <w:num w:numId="1">
     <w:abstractNumId w:val="2"/>
   </w:num>
-  <w:num w:numId="2" w16cid:durableId="562528008">
+  <w:num w:numId="2">
     <w:abstractNumId w:val="9"/>
   </w:num>
-  <w:num w:numId="3" w16cid:durableId="1429958344">
+  <w:num w:numId="3">
     <w:abstractNumId w:val="5"/>
   </w:num>
-  <w:num w:numId="4" w16cid:durableId="436095458">
+  <w:num w:numId="4">
     <w:abstractNumId w:val="1"/>
   </w:num>
-  <w:num w:numId="5" w16cid:durableId="1269392653">
+  <w:num w:numId="5">
     <w:abstractNumId w:val="6"/>
   </w:num>
-  <w:num w:numId="6" w16cid:durableId="1020936800">
+  <w:num w:numId="6">
     <w:abstractNumId w:val="7"/>
   </w:num>
-  <w:num w:numId="7" w16cid:durableId="136000674">
+  <w:num w:numId="7">
     <w:abstractNumId w:val="0"/>
   </w:num>
-  <w:num w:numId="8" w16cid:durableId="618486708">
+  <w:num w:numId="8">
     <w:abstractNumId w:val="8"/>
   </w:num>
-  <w:num w:numId="9" w16cid:durableId="1198742252">
+  <w:num w:numId="9">
     <w:abstractNumId w:val="3"/>
   </w:num>
-  <w:num w:numId="10" w16cid:durableId="187110455">
+  <w:num w:numId="10">
     <w:abstractNumId w:val="4"/>
   </w:num>
 </w:numbering>
 </file>
 
 <file path=word/styles.xml><?xml version="1.0" encoding="utf-8"?>
-<w:styles xmlns:mc="http://schemas.openxmlformats.org/markup-compatibility/2006" xmlns:r="http://schemas.openxmlformats.org/officeDocument/2006/relationships" xmlns:w="http://schemas.openxmlformats.org/wordprocessingml/2006/main" xmlns:w14="http://schemas.microsoft.com/office/word/2010/wordml" xmlns:w15="http://schemas.microsoft.com/office/word/2012/wordml" xmlns:w16cex="http://schemas.microsoft.com/office/word/2018/wordml/cex" xmlns:w16cid="http://schemas.microsoft.com/office/word/2016/wordml/cid" xmlns:w16="http://schemas.microsoft.com/office/word/2018/wordml" xmlns:w16du="http://schemas.microsoft.com/office/word/2023/wordml/word16du" xmlns:w16sdtdh="http://schemas.microsoft.com/office/word/2020/wordml/sdtdatahash" xmlns:w16sdtfl="http://schemas.microsoft.com/office/word/2024/wordml/sdtformatlock" xmlns:w16se="http://schemas.microsoft.com/office/word/2015/wordml/symex" mc:Ignorable="w14 w15 w16se w16cid w16 w16cex w16sdtdh w16sdtfl w16du">
+<w:styles xmlns:mc="http://schemas.openxmlformats.org/markup-compatibility/2006" xmlns:r="http://schemas.openxmlformats.org/officeDocument/2006/relationships" xmlns:w="http://schemas.openxmlformats.org/wordprocessingml/2006/main" xmlns:w14="http://schemas.microsoft.com/office/word/2010/wordml" xmlns:w15="http://schemas.microsoft.com/office/word/2012/wordml" xmlns:w16cex="http://schemas.microsoft.com/office/word/2018/wordml/cex" xmlns:w16cid="http://schemas.microsoft.com/office/word/2016/wordml/cid" xmlns:w16="http://schemas.microsoft.com/office/word/2018/wordml" xmlns:w16se="http://schemas.microsoft.com/office/word/2015/wordml/symex" mc:Ignorable="w14 w15 w16se w16cid w16 w16cex">
   <w:docDefaults>
     <w:rPrDefault>
       <w:rPr>
@@ -4402,7 +4771,6 @@
   <w:style w:type="character" w:default="1" w:styleId="DefaultParagraphFont">
     <w:name w:val="Default Paragraph Font"/>
     <w:uiPriority w:val="1"/>
-    <w:semiHidden/>
     <w:unhideWhenUsed/>
   </w:style>
   <w:style w:type="table" w:default="1" w:styleId="TableNormal">

</xml_diff>

<commit_message>
fix: support light theme on quotation page, resilient spacing for carrier placeholders, enforce PDF only download
</commit_message>
<xml_diff>
--- a/assets/Argus_Ambient_Premium_Quotation.docx
+++ b/assets/Argus_Ambient_Premium_Quotation.docx
@@ -68,9 +68,8 @@
                 <w:sz w:val="18"/>
                 <w:szCs w:val="18"/>
               </w:rPr>
-              <w:t>Q.</w:t>
-            </w:r>
-            <w:proofErr w:type="gramStart"/>
+              <w:t>Q.NO</w:t>
+            </w:r>
             <w:r>
               <w:rPr>
                 <w:b/>
@@ -78,26 +77,7 @@
                 <w:sz w:val="18"/>
                 <w:szCs w:val="18"/>
               </w:rPr>
-              <w:t>NO</w:t>
-            </w:r>
-            <w:r>
-              <w:rPr>
-                <w:b/>
-                <w:bCs/>
-                <w:sz w:val="18"/>
-                <w:szCs w:val="18"/>
-              </w:rPr>
-              <w:t xml:space="preserve"> :</w:t>
-            </w:r>
-            <w:proofErr w:type="gramEnd"/>
-            <w:r>
-              <w:rPr>
-                <w:b/>
-                <w:bCs/>
-                <w:sz w:val="18"/>
-                <w:szCs w:val="18"/>
-              </w:rPr>
-              <w:t xml:space="preserve"> </w:t>
+              <w:t xml:space="preserve"> : </w:t>
             </w:r>
             <w:r>
               <w:rPr>
@@ -107,29 +87,7 @@
                 <w:sz w:val="18"/>
                 <w:szCs w:val="18"/>
               </w:rPr>
-              <w:t>{</w:t>
-            </w:r>
-            <w:proofErr w:type="spellStart"/>
-            <w:r>
-              <w:rPr>
-                <w:b/>
-                <w:bCs/>
-                <w:color w:val="FF0000"/>
-                <w:sz w:val="18"/>
-                <w:szCs w:val="18"/>
-              </w:rPr>
-              <w:t>Q_no</w:t>
-            </w:r>
-            <w:proofErr w:type="spellEnd"/>
-            <w:r>
-              <w:rPr>
-                <w:b/>
-                <w:bCs/>
-                <w:color w:val="FF0000"/>
-                <w:sz w:val="18"/>
-                <w:szCs w:val="18"/>
-              </w:rPr>
-              <w:t>}</w:t>
+              <w:t>{Q_no}</w:t>
             </w:r>
           </w:p>
           <w:p>
@@ -354,9 +312,10 @@
         <w:tblLook w:val="04A0" w:firstRow="1" w:lastRow="0" w:firstColumn="1" w:lastColumn="0" w:noHBand="0" w:noVBand="1"/>
       </w:tblPr>
       <w:tblGrid>
-        <w:gridCol w:w="3596"/>
-        <w:gridCol w:w="3597"/>
-        <w:gridCol w:w="3597"/>
+        <w:gridCol w:w="2628"/>
+        <w:gridCol w:w="2712"/>
+        <w:gridCol w:w="2762"/>
+        <w:gridCol w:w="2698"/>
       </w:tblGrid>
       <w:tr>
         <w:trPr>
@@ -364,7 +323,7 @@
         </w:trPr>
         <w:tc>
           <w:tcPr>
-            <w:tcW w:w="3596" w:type="dxa"/>
+            <w:tcW w:w="2711" w:type="dxa"/>
             <w:shd w:val="clear" w:color="auto" w:fill="404040" w:themeFill="text1" w:themeFillTint="BF"/>
           </w:tcPr>
           <w:p>
@@ -390,7 +349,7 @@
         </w:tc>
         <w:tc>
           <w:tcPr>
-            <w:tcW w:w="3597" w:type="dxa"/>
+            <w:tcW w:w="2787" w:type="dxa"/>
             <w:shd w:val="clear" w:color="auto" w:fill="404040" w:themeFill="text1" w:themeFillTint="BF"/>
           </w:tcPr>
           <w:p>
@@ -416,7 +375,7 @@
         </w:tc>
         <w:tc>
           <w:tcPr>
-            <w:tcW w:w="3597" w:type="dxa"/>
+            <w:tcW w:w="2833" w:type="dxa"/>
             <w:shd w:val="clear" w:color="auto" w:fill="404040" w:themeFill="text1" w:themeFillTint="BF"/>
           </w:tcPr>
           <w:p>
@@ -437,6 +396,32 @@
                 <w:color w:val="FFFFFF" w:themeColor="background1"/>
               </w:rPr>
               <w:t>COMMODITY</w:t>
+            </w:r>
+          </w:p>
+        </w:tc>
+        <w:tc>
+          <w:tcPr>
+            <w:tcW w:w="2469" w:type="dxa"/>
+            <w:shd w:val="clear" w:color="auto" w:fill="404040" w:themeFill="text1" w:themeFillTint="BF"/>
+          </w:tcPr>
+          <w:p>
+            <w:pPr>
+              <w:spacing w:before="240" w:line="480" w:lineRule="auto"/>
+              <w:ind w:left="0" w:firstLine="0"/>
+              <w:jc w:val="center"/>
+              <w:rPr>
+                <w:b/>
+                <w:bCs/>
+                <w:color w:val="FF0000"/>
+              </w:rPr>
+            </w:pPr>
+            <w:r>
+              <w:rPr>
+                <w:b/>
+                <w:bCs/>
+                <w:color w:val="FF0000"/>
+              </w:rPr>
+              <w:t>{CARRIER/AIRLINE/TRUCK}</w:t>
             </w:r>
           </w:p>
         </w:tc>
@@ -447,7 +432,7 @@
         </w:trPr>
         <w:tc>
           <w:tcPr>
-            <w:tcW w:w="3596" w:type="dxa"/>
+            <w:tcW w:w="2711" w:type="dxa"/>
             <w:shd w:val="clear" w:color="auto" w:fill="F2F2F2" w:themeFill="background1" w:themeFillShade="F2"/>
           </w:tcPr>
           <w:p>
@@ -469,7 +454,7 @@
         </w:tc>
         <w:tc>
           <w:tcPr>
-            <w:tcW w:w="3597" w:type="dxa"/>
+            <w:tcW w:w="2787" w:type="dxa"/>
             <w:shd w:val="clear" w:color="auto" w:fill="F2F2F2" w:themeFill="background1" w:themeFillShade="F2"/>
           </w:tcPr>
           <w:p>
@@ -491,7 +476,7 @@
         </w:tc>
         <w:tc>
           <w:tcPr>
-            <w:tcW w:w="3597" w:type="dxa"/>
+            <w:tcW w:w="2833" w:type="dxa"/>
             <w:shd w:val="clear" w:color="auto" w:fill="F2F2F2" w:themeFill="background1" w:themeFillShade="F2"/>
           </w:tcPr>
           <w:p>
@@ -508,6 +493,94 @@
                 <w:color w:val="FF0000"/>
               </w:rPr>
               <w:t>{COMMODITY}</w:t>
+            </w:r>
+          </w:p>
+        </w:tc>
+        <w:tc>
+          <w:tcPr>
+            <w:tcW w:w="2469" w:type="dxa"/>
+            <w:shd w:val="clear" w:color="auto" w:fill="F2F2F2" w:themeFill="background1" w:themeFillShade="F2"/>
+          </w:tcPr>
+          <w:p>
+            <w:pPr>
+              <w:spacing w:before="240" w:line="480" w:lineRule="auto"/>
+              <w:ind w:left="0" w:firstLine="0"/>
+              <w:jc w:val="center"/>
+              <w:rPr>
+                <w:color w:val="FF0000"/>
+              </w:rPr>
+            </w:pPr>
+            <w:r>
+              <w:rPr>
+                <w:b/>
+                <w:bCs/>
+                <w:color w:val="FF0000"/>
+              </w:rPr>
+              <w:t>{CARRIER</w:t>
+            </w:r>
+            <w:r>
+              <w:rPr>
+                <w:b/>
+                <w:bCs/>
+                <w:color w:val="FF0000"/>
+              </w:rPr>
+              <w:t>_name</w:t>
+            </w:r>
+            <w:r>
+              <w:rPr>
+                <w:b/>
+                <w:bCs/>
+                <w:color w:val="FF0000"/>
+              </w:rPr>
+              <w:t>/AIRLINE</w:t>
+            </w:r>
+            <w:r>
+              <w:rPr>
+                <w:b/>
+                <w:bCs/>
+                <w:color w:val="FF0000"/>
+              </w:rPr>
+              <w:t>_name</w:t>
+            </w:r>
+            <w:r>
+              <w:rPr>
+                <w:b/>
+                <w:bCs/>
+                <w:color w:val="FF0000"/>
+              </w:rPr>
+              <w:t xml:space="preserve"> </w:t>
+            </w:r>
+            <w:r>
+              <w:rPr>
+                <w:b/>
+                <w:bCs/>
+                <w:color w:val="FF0000"/>
+              </w:rPr>
+              <w:t>/TRUCK</w:t>
+            </w:r>
+            <w:r>
+              <w:rPr>
+                <w:b/>
+                <w:bCs/>
+                <w:color w:val="FF0000"/>
+              </w:rPr>
+              <w:t>_name</w:t>
+            </w:r>
+            <w:r>
+              <w:rPr>
+                <w:b/>
+                <w:bCs/>
+                <w:color w:val="FF0000"/>
+              </w:rPr>
+              <w:t xml:space="preserve"> </w:t>
+            </w:r>
+            <w:r>
+              <w:rPr>
+                <w:b/>
+                <w:bCs/>
+                <w:color w:val="FF0000"/>
+              </w:rPr>
+              <w:t>}</w:t>
             </w:r>
           </w:p>
         </w:tc>
@@ -2711,27 +2784,7 @@
           <w:sz w:val="13"/>
           <w:szCs w:val="13"/>
         </w:rPr>
-        <w:t xml:space="preserve">Clearance Documentation: The consignee is legally obligated to submit all authentic original documents required for customs clearance, including but not limited to: </w:t>
-      </w:r>
-      <w:proofErr w:type="gramStart"/>
-      <w:r>
-        <w:rPr>
-          <w:b/>
-          <w:bCs/>
-          <w:sz w:val="13"/>
-          <w:szCs w:val="13"/>
-        </w:rPr>
-        <w:t>a</w:t>
-      </w:r>
-      <w:proofErr w:type="gramEnd"/>
-      <w:r>
-        <w:rPr>
-          <w:b/>
-          <w:bCs/>
-          <w:sz w:val="13"/>
-          <w:szCs w:val="13"/>
-        </w:rPr>
-        <w:t xml:space="preserve"> Certificate of Origin (COO), and a Chamber of Commerce-attested Commercial Invoice and Packing List.</w:t>
+        <w:t>Clearance Documentation: The consignee is legally obligated to submit all authentic original documents required for customs clearance, including but not limited to: a Certificate of Origin (COO), and a Chamber of Commerce-attested Commercial Invoice and Packing List.</w:t>
       </w:r>
     </w:p>
     <w:p>
@@ -2756,47 +2809,7 @@
           <w:sz w:val="13"/>
           <w:szCs w:val="13"/>
         </w:rPr>
-        <w:t xml:space="preserve">Import Licensing &amp; Approvals: The consignee must hold a valid, active import license registered in Qatar authorizing the import of the specific commodities involved. The arrangement and procurement of specialized ministry approvals (e.g., </w:t>
-      </w:r>
-      <w:proofErr w:type="spellStart"/>
-      <w:r>
-        <w:rPr>
-          <w:b/>
-          <w:bCs/>
-          <w:sz w:val="13"/>
-          <w:szCs w:val="13"/>
-        </w:rPr>
-        <w:t>MoPH</w:t>
-      </w:r>
-      <w:proofErr w:type="spellEnd"/>
-      <w:r>
-        <w:rPr>
-          <w:b/>
-          <w:bCs/>
-          <w:sz w:val="13"/>
-          <w:szCs w:val="13"/>
-        </w:rPr>
-        <w:t xml:space="preserve">, </w:t>
-      </w:r>
-      <w:proofErr w:type="spellStart"/>
-      <w:r>
-        <w:rPr>
-          <w:b/>
-          <w:bCs/>
-          <w:sz w:val="13"/>
-          <w:szCs w:val="13"/>
-        </w:rPr>
-        <w:t>MoECC</w:t>
-      </w:r>
-      <w:proofErr w:type="spellEnd"/>
-      <w:r>
-        <w:rPr>
-          <w:b/>
-          <w:bCs/>
-          <w:sz w:val="13"/>
-          <w:szCs w:val="13"/>
-        </w:rPr>
-        <w:t>), health certificates, or environmental permits rest entirely under the consignee's scope and responsibility.</w:t>
+        <w:t>Import Licensing &amp; Approvals: The consignee must hold a valid, active import license registered in Qatar authorizing the import of the specific commodities involved. The arrangement and procurement of specialized ministry approvals (e.g., MoPH, MoECC), health certificates, or environmental permits rest entirely under the consignee's scope and responsibility.</w:t>
       </w:r>
     </w:p>
     <w:p>

</xml_diff>

<commit_message>
feat: add Mark as Read button for email replies in RFQDetailModal and ConfirmedShipmentModal
</commit_message>
<xml_diff>
--- a/assets/Argus_Ambient_Premium_Quotation.docx
+++ b/assets/Argus_Ambient_Premium_Quotation.docx
@@ -68,8 +68,9 @@
                 <w:sz w:val="18"/>
                 <w:szCs w:val="18"/>
               </w:rPr>
-              <w:t>Q.NO</w:t>
-            </w:r>
+              <w:t>Q.</w:t>
+            </w:r>
+            <w:proofErr w:type="gramStart"/>
             <w:r>
               <w:rPr>
                 <w:b/>
@@ -77,7 +78,26 @@
                 <w:sz w:val="18"/>
                 <w:szCs w:val="18"/>
               </w:rPr>
-              <w:t xml:space="preserve"> : </w:t>
+              <w:t>NO</w:t>
+            </w:r>
+            <w:r>
+              <w:rPr>
+                <w:b/>
+                <w:bCs/>
+                <w:sz w:val="18"/>
+                <w:szCs w:val="18"/>
+              </w:rPr>
+              <w:t xml:space="preserve"> :</w:t>
+            </w:r>
+            <w:proofErr w:type="gramEnd"/>
+            <w:r>
+              <w:rPr>
+                <w:b/>
+                <w:bCs/>
+                <w:sz w:val="18"/>
+                <w:szCs w:val="18"/>
+              </w:rPr>
+              <w:t xml:space="preserve"> </w:t>
             </w:r>
             <w:r>
               <w:rPr>
@@ -87,7 +107,29 @@
                 <w:sz w:val="18"/>
                 <w:szCs w:val="18"/>
               </w:rPr>
-              <w:t>{Q_no}</w:t>
+              <w:t>{</w:t>
+            </w:r>
+            <w:proofErr w:type="spellStart"/>
+            <w:r>
+              <w:rPr>
+                <w:b/>
+                <w:bCs/>
+                <w:color w:val="FF0000"/>
+                <w:sz w:val="18"/>
+                <w:szCs w:val="18"/>
+              </w:rPr>
+              <w:t>Q_no</w:t>
+            </w:r>
+            <w:proofErr w:type="spellEnd"/>
+            <w:r>
+              <w:rPr>
+                <w:b/>
+                <w:bCs/>
+                <w:color w:val="FF0000"/>
+                <w:sz w:val="18"/>
+                <w:szCs w:val="18"/>
+              </w:rPr>
+              <w:t>}</w:t>
             </w:r>
           </w:p>
           <w:p>
@@ -103,7 +145,19 @@
               <w:rPr>
                 <w:color w:val="787878"/>
               </w:rPr>
-              <w:t>C.R No. 12345, P.O Box: 31861, Doha, Qatar</w:t>
+              <w:t xml:space="preserve">C.R No. </w:t>
+            </w:r>
+            <w:r>
+              <w:rPr>
+                <w:color w:val="787878"/>
+              </w:rPr>
+              <w:t>147553</w:t>
+            </w:r>
+            <w:r>
+              <w:rPr>
+                <w:color w:val="787878"/>
+              </w:rPr>
+              <w:t>, P.O Box: 31861, Doha, Qatar</w:t>
             </w:r>
             <w:r>
               <w:rPr>
@@ -516,15 +570,16 @@
                 <w:bCs/>
                 <w:color w:val="FF0000"/>
               </w:rPr>
-              <w:t>{CARRIER</w:t>
-            </w:r>
+              <w:t>{</w:t>
+            </w:r>
+            <w:proofErr w:type="spellStart"/>
             <w:r>
               <w:rPr>
                 <w:b/>
                 <w:bCs/>
                 <w:color w:val="FF0000"/>
               </w:rPr>
-              <w:t>_name</w:t>
+              <w:t>CARRIER</w:t>
             </w:r>
             <w:r>
               <w:rPr>
@@ -532,23 +587,25 @@
                 <w:bCs/>
                 <w:color w:val="FF0000"/>
               </w:rPr>
-              <w:t>/AIRLINE</w:t>
-            </w:r>
+              <w:t>_name</w:t>
+            </w:r>
+            <w:proofErr w:type="spellEnd"/>
             <w:r>
               <w:rPr>
                 <w:b/>
                 <w:bCs/>
                 <w:color w:val="FF0000"/>
               </w:rPr>
-              <w:t>_name</w:t>
-            </w:r>
+              <w:t>/</w:t>
+            </w:r>
+            <w:proofErr w:type="spellStart"/>
             <w:r>
               <w:rPr>
                 <w:b/>
                 <w:bCs/>
                 <w:color w:val="FF0000"/>
               </w:rPr>
-              <w:t xml:space="preserve"> </w:t>
+              <w:t>AIRLINE</w:t>
             </w:r>
             <w:r>
               <w:rPr>
@@ -556,23 +613,25 @@
                 <w:bCs/>
                 <w:color w:val="FF0000"/>
               </w:rPr>
-              <w:t>/TRUCK</w:t>
-            </w:r>
+              <w:t>_name</w:t>
+            </w:r>
+            <w:proofErr w:type="spellEnd"/>
             <w:r>
               <w:rPr>
                 <w:b/>
                 <w:bCs/>
                 <w:color w:val="FF0000"/>
               </w:rPr>
-              <w:t>_name</w:t>
-            </w:r>
+              <w:t xml:space="preserve"> /</w:t>
+            </w:r>
+            <w:proofErr w:type="spellStart"/>
             <w:r>
               <w:rPr>
                 <w:b/>
                 <w:bCs/>
                 <w:color w:val="FF0000"/>
               </w:rPr>
-              <w:t xml:space="preserve"> </w:t>
+              <w:t>TRUCK</w:t>
             </w:r>
             <w:r>
               <w:rPr>
@@ -580,8 +639,27 @@
                 <w:bCs/>
                 <w:color w:val="FF0000"/>
               </w:rPr>
-              <w:t>}</w:t>
-            </w:r>
+              <w:t>_</w:t>
+            </w:r>
+            <w:proofErr w:type="gramStart"/>
+            <w:r>
+              <w:rPr>
+                <w:b/>
+                <w:bCs/>
+                <w:color w:val="FF0000"/>
+              </w:rPr>
+              <w:t>name</w:t>
+            </w:r>
+            <w:proofErr w:type="spellEnd"/>
+            <w:r>
+              <w:rPr>
+                <w:b/>
+                <w:bCs/>
+                <w:color w:val="FF0000"/>
+              </w:rPr>
+              <w:t xml:space="preserve"> }</w:t>
+            </w:r>
+            <w:proofErr w:type="gramEnd"/>
           </w:p>
         </w:tc>
       </w:tr>
@@ -962,23 +1040,7 @@
                 <w:sz w:val="19"/>
                 <w:szCs w:val="19"/>
               </w:rPr>
-              <w:t>{FREIGHT</w:t>
-            </w:r>
-            <w:r>
-              <w:rPr>
-                <w:color w:val="FF0000"/>
-                <w:sz w:val="19"/>
-                <w:szCs w:val="19"/>
-              </w:rPr>
-              <w:t>_USD</w:t>
-            </w:r>
-            <w:r>
-              <w:rPr>
-                <w:color w:val="FF0000"/>
-                <w:sz w:val="19"/>
-                <w:szCs w:val="19"/>
-              </w:rPr>
-              <w:t>}</w:t>
+              <w:t>{FREIGHT_USD}</w:t>
             </w:r>
           </w:p>
         </w:tc>
@@ -2784,7 +2846,27 @@
           <w:sz w:val="13"/>
           <w:szCs w:val="13"/>
         </w:rPr>
-        <w:t>Clearance Documentation: The consignee is legally obligated to submit all authentic original documents required for customs clearance, including but not limited to: a Certificate of Origin (COO), and a Chamber of Commerce-attested Commercial Invoice and Packing List.</w:t>
+        <w:t xml:space="preserve">Clearance Documentation: The consignee is legally obligated to submit all authentic original documents required for customs clearance, including but not limited to: </w:t>
+      </w:r>
+      <w:proofErr w:type="gramStart"/>
+      <w:r>
+        <w:rPr>
+          <w:b/>
+          <w:bCs/>
+          <w:sz w:val="13"/>
+          <w:szCs w:val="13"/>
+        </w:rPr>
+        <w:t>a</w:t>
+      </w:r>
+      <w:proofErr w:type="gramEnd"/>
+      <w:r>
+        <w:rPr>
+          <w:b/>
+          <w:bCs/>
+          <w:sz w:val="13"/>
+          <w:szCs w:val="13"/>
+        </w:rPr>
+        <w:t xml:space="preserve"> Certificate of Origin (COO), and a Chamber of Commerce-attested Commercial Invoice and Packing List.</w:t>
       </w:r>
     </w:p>
     <w:p>
@@ -2809,7 +2891,47 @@
           <w:sz w:val="13"/>
           <w:szCs w:val="13"/>
         </w:rPr>
-        <w:t>Import Licensing &amp; Approvals: The consignee must hold a valid, active import license registered in Qatar authorizing the import of the specific commodities involved. The arrangement and procurement of specialized ministry approvals (e.g., MoPH, MoECC), health certificates, or environmental permits rest entirely under the consignee's scope and responsibility.</w:t>
+        <w:t xml:space="preserve">Import Licensing &amp; Approvals: The consignee must hold a valid, active import license registered in Qatar authorizing the import of the specific commodities involved. The arrangement and procurement of specialized ministry approvals (e.g., </w:t>
+      </w:r>
+      <w:proofErr w:type="spellStart"/>
+      <w:r>
+        <w:rPr>
+          <w:b/>
+          <w:bCs/>
+          <w:sz w:val="13"/>
+          <w:szCs w:val="13"/>
+        </w:rPr>
+        <w:t>MoPH</w:t>
+      </w:r>
+      <w:proofErr w:type="spellEnd"/>
+      <w:r>
+        <w:rPr>
+          <w:b/>
+          <w:bCs/>
+          <w:sz w:val="13"/>
+          <w:szCs w:val="13"/>
+        </w:rPr>
+        <w:t xml:space="preserve">, </w:t>
+      </w:r>
+      <w:proofErr w:type="spellStart"/>
+      <w:r>
+        <w:rPr>
+          <w:b/>
+          <w:bCs/>
+          <w:sz w:val="13"/>
+          <w:szCs w:val="13"/>
+        </w:rPr>
+        <w:t>MoECC</w:t>
+      </w:r>
+      <w:proofErr w:type="spellEnd"/>
+      <w:r>
+        <w:rPr>
+          <w:b/>
+          <w:bCs/>
+          <w:sz w:val="13"/>
+          <w:szCs w:val="13"/>
+        </w:rPr>
+        <w:t>), health certificates, or environmental permits rest entirely under the consignee's scope and responsibility.</w:t>
       </w:r>
     </w:p>
     <w:p>
@@ -4784,6 +4906,7 @@
   <w:style w:type="character" w:default="1" w:styleId="DefaultParagraphFont">
     <w:name w:val="Default Paragraph Font"/>
     <w:uiPriority w:val="1"/>
+    <w:semiHidden/>
     <w:unhideWhenUsed/>
   </w:style>
   <w:style w:type="table" w:default="1" w:styleId="TableNormal">

</xml_diff>